<commit_message>
docs(evidencia): AS-06 con el manejador de bloqueo y alerta #2 de CodeQL en el informe 3 [AS-06] [SYS-FN-07] [ISO/IEC 27002 8.29]
- Fila de evidencia de AS-06: SYS-FN-07 registra el manejador de
  CuentaBloqueada en la composición sin modificar el despachador (66957e3).
- Informe 3: la alerta js/double-escaping del generador de informes y su
  corrección (dfe8e42), y la ejecución 39042977012 en el anexo A.

Co-Authored-By: Claude Opus 5.5 <noreply@anthropic.com>
</commit_message>
<xml_diff>
--- a/docs/informes/Informe3_Programacion_Segura_AbasteceNi_v1.0.docx
+++ b/docs/informes/Informe3_Programacion_Segura_AbasteceNi_v1.0.docx
@@ -5759,6 +5759,177 @@
           </w:p>
         </w:tc>
       </w:tr>
+      <w:tr>
+        <w:tc>
+          <w:tcPr>
+            <w:tcW w:type="dxa" w:w="748"/>
+            <w:tcBorders>
+              <w:top w:val="single" w:color="A6A6A6" w:sz="4"/>
+              <w:left w:val="single" w:color="A6A6A6" w:sz="4"/>
+              <w:bottom w:val="single" w:color="A6A6A6" w:sz="4"/>
+              <w:right w:val="single" w:color="A6A6A6" w:sz="4"/>
+            </w:tcBorders>
+            <w:tcMar>
+              <w:top w:type="dxa" w:w="60"/>
+              <w:left w:type="dxa" w:w="90"/>
+              <w:bottom w:type="dxa" w:w="60"/>
+              <w:right w:type="dxa" w:w="90"/>
+            </w:tcMar>
+          </w:tcPr>
+          <w:p>
+            <w:pPr>
+              <w:spacing w:after="30"/>
+            </w:pPr>
+            <w:r>
+              <w:rPr>
+                <w:sz w:val="18"/>
+                <w:szCs w:val="18"/>
+              </w:rPr>
+              <w:t xml:space="preserve">#2</w:t>
+            </w:r>
+          </w:p>
+        </w:tc>
+        <w:tc>
+          <w:tcPr>
+            <w:tcW w:type="dxa" w:w="1872"/>
+            <w:tcBorders>
+              <w:top w:val="single" w:color="A6A6A6" w:sz="4"/>
+              <w:left w:val="single" w:color="A6A6A6" w:sz="4"/>
+              <w:bottom w:val="single" w:color="A6A6A6" w:sz="4"/>
+              <w:right w:val="single" w:color="A6A6A6" w:sz="4"/>
+            </w:tcBorders>
+            <w:tcMar>
+              <w:top w:type="dxa" w:w="60"/>
+              <w:left w:type="dxa" w:w="90"/>
+              <w:bottom w:type="dxa" w:w="60"/>
+              <w:right w:type="dxa" w:w="90"/>
+            </w:tcMar>
+          </w:tcPr>
+          <w:p>
+            <w:pPr>
+              <w:spacing w:after="30"/>
+            </w:pPr>
+            <w:r>
+              <w:rPr>
+                <w:rFonts w:ascii="Consolas" w:cs="Consolas" w:eastAsia="Consolas" w:hAnsi="Consolas"/>
+                <w:sz w:val="18"/>
+                <w:szCs w:val="18"/>
+              </w:rPr>
+              <w:t xml:space="preserve">js/double-escaping</w:t>
+            </w:r>
+            <w:r>
+              <w:rPr>
+                <w:sz w:val="18"/>
+                <w:szCs w:val="18"/>
+              </w:rPr>
+              <w:t xml:space="preserve">, alta</w:t>
+            </w:r>
+          </w:p>
+        </w:tc>
+        <w:tc>
+          <w:tcPr>
+            <w:tcW w:type="dxa" w:w="1497"/>
+            <w:tcBorders>
+              <w:top w:val="single" w:color="A6A6A6" w:sz="4"/>
+              <w:left w:val="single" w:color="A6A6A6" w:sz="4"/>
+              <w:bottom w:val="single" w:color="A6A6A6" w:sz="4"/>
+              <w:right w:val="single" w:color="A6A6A6" w:sz="4"/>
+            </w:tcBorders>
+            <w:tcMar>
+              <w:top w:type="dxa" w:w="60"/>
+              <w:left w:type="dxa" w:w="90"/>
+              <w:bottom w:type="dxa" w:w="60"/>
+              <w:right w:type="dxa" w:w="90"/>
+            </w:tcMar>
+          </w:tcPr>
+          <w:p>
+            <w:pPr>
+              <w:spacing w:after="30"/>
+            </w:pPr>
+            <w:r>
+              <w:rPr>
+                <w:rFonts w:ascii="Consolas" w:cs="Consolas" w:eastAsia="Consolas" w:hAnsi="Consolas"/>
+                <w:sz w:val="18"/>
+                <w:szCs w:val="18"/>
+              </w:rPr>
+              <w:t xml:space="preserve">herramientas/informes/comun.js:153</w:t>
+            </w:r>
+          </w:p>
+        </w:tc>
+        <w:tc>
+          <w:tcPr>
+            <w:tcW w:type="dxa" w:w="3556"/>
+            <w:tcBorders>
+              <w:top w:val="single" w:color="A6A6A6" w:sz="4"/>
+              <w:left w:val="single" w:color="A6A6A6" w:sz="4"/>
+              <w:bottom w:val="single" w:color="A6A6A6" w:sz="4"/>
+              <w:right w:val="single" w:color="A6A6A6" w:sz="4"/>
+            </w:tcBorders>
+            <w:tcMar>
+              <w:top w:type="dxa" w:w="60"/>
+              <w:left w:type="dxa" w:w="90"/>
+              <w:bottom w:type="dxa" w:w="60"/>
+              <w:right w:type="dxa" w:w="90"/>
+            </w:tcMar>
+          </w:tcPr>
+          <w:p>
+            <w:pPr>
+              <w:spacing w:after="30"/>
+            </w:pPr>
+            <w:r>
+              <w:rPr>
+                <w:sz w:val="18"/>
+                <w:szCs w:val="18"/>
+              </w:rPr>
+              <w:t xml:space="preserve">El generador de estos informes decodificaba las entidades de los reportes JUnit con reemplazos encadenados, de modo que «&amp;amp;lt;» terminaba como «&lt;». No forma parte del producto: lee reportes que produce la propia CI y no genera HTML.</w:t>
+            </w:r>
+          </w:p>
+        </w:tc>
+        <w:tc>
+          <w:tcPr>
+            <w:tcW w:type="dxa" w:w="1687"/>
+            <w:tcBorders>
+              <w:top w:val="single" w:color="A6A6A6" w:sz="4"/>
+              <w:left w:val="single" w:color="A6A6A6" w:sz="4"/>
+              <w:bottom w:val="single" w:color="A6A6A6" w:sz="4"/>
+              <w:right w:val="single" w:color="A6A6A6" w:sz="4"/>
+            </w:tcBorders>
+            <w:tcMar>
+              <w:top w:type="dxa" w:w="60"/>
+              <w:left w:type="dxa" w:w="90"/>
+              <w:bottom w:type="dxa" w:w="60"/>
+              <w:right w:type="dxa" w:w="90"/>
+            </w:tcMar>
+          </w:tcPr>
+          <w:p>
+            <w:pPr>
+              <w:spacing w:after="30"/>
+            </w:pPr>
+            <w:r>
+              <w:rPr>
+                <w:sz w:val="18"/>
+                <w:szCs w:val="18"/>
+              </w:rPr>
+              <w:t xml:space="preserve">Corregida con una decodificación de una sola pasada (commit </w:t>
+            </w:r>
+            <w:r>
+              <w:rPr>
+                <w:rFonts w:ascii="Consolas" w:cs="Consolas" w:eastAsia="Consolas" w:hAnsi="Consolas"/>
+                <w:sz w:val="18"/>
+                <w:szCs w:val="18"/>
+              </w:rPr>
+              <w:t xml:space="preserve">dfe8e42</w:t>
+            </w:r>
+            <w:r>
+              <w:rPr>
+                <w:sz w:val="18"/>
+                <w:szCs w:val="18"/>
+              </w:rPr>
+              <w:t xml:space="preserve">); CodeQL la cerró en la ejecución siguiente</w:t>
+            </w:r>
+          </w:p>
+        </w:tc>
+      </w:tr>
     </w:tbl>
     <w:p>
       <w:pPr>
@@ -8571,7 +8742,7 @@
         <w:jc w:val="both"/>
       </w:pPr>
       <w:r>
-        <w:t xml:space="preserve">El análisis estático encontró una alerta de gravedad alta. Se analizó y se descartó con justificación documentada, porque corresponde a una decisión de arquitectura cuyas protecciones están implementadas y probadas. La auditoría de dependencias no tiene hallazgos altos ni críticos. Del tramo B se construyó el bloqueo por intentos fallidos (SYS-FN-07). Los requisitos de seguridad pendientes están identificados: recuperación, segundo factor y límite de dispositivos, y los que dependen de la infraestructura de producción.</w:t>
+        <w:t xml:space="preserve">El análisis estático encontró dos alertas de gravedad alta. La del código del producto se analizó y se descartó con justificación documentada, porque corresponde a una decisión de arquitectura cuyas protecciones están implementadas y probadas; la del generador de informes se corrigió. La auditoría de dependencias no tiene hallazgos altos ni críticos. Del tramo B se construyó el bloqueo por intentos fallidos (SYS-FN-07). Los requisitos de seguridad pendientes están identificados: recuperación, segundo factor y límite de dispositivos, y los que dependen de la infraestructura de producción.</w:t>
       </w:r>
     </w:p>
     <w:p>
@@ -9314,6 +9485,125 @@
                 <w:szCs w:val="18"/>
               </w:rPr>
               <w:t xml:space="preserve">it-02/informes</w:t>
+            </w:r>
+          </w:p>
+        </w:tc>
+        <w:tc>
+          <w:tcPr>
+            <w:tcW w:type="dxa" w:w="2340"/>
+            <w:tcBorders>
+              <w:top w:val="single" w:color="A6A6A6" w:sz="4"/>
+              <w:left w:val="single" w:color="A6A6A6" w:sz="4"/>
+              <w:bottom w:val="single" w:color="A6A6A6" w:sz="4"/>
+              <w:right w:val="single" w:color="A6A6A6" w:sz="4"/>
+            </w:tcBorders>
+            <w:tcMar>
+              <w:top w:type="dxa" w:w="60"/>
+              <w:left w:type="dxa" w:w="90"/>
+              <w:bottom w:type="dxa" w:w="60"/>
+              <w:right w:type="dxa" w:w="90"/>
+            </w:tcMar>
+          </w:tcPr>
+          <w:p>
+            <w:pPr>
+              <w:spacing w:after="30"/>
+            </w:pPr>
+            <w:r>
+              <w:rPr>
+                <w:sz w:val="18"/>
+                <w:szCs w:val="18"/>
+              </w:rPr>
+              <w:t xml:space="preserve">En verde</w:t>
+            </w:r>
+          </w:p>
+        </w:tc>
+        <w:tc>
+          <w:tcPr>
+            <w:tcW w:type="dxa" w:w="2341"/>
+            <w:tcBorders>
+              <w:top w:val="single" w:color="A6A6A6" w:sz="4"/>
+              <w:left w:val="single" w:color="A6A6A6" w:sz="4"/>
+              <w:bottom w:val="single" w:color="A6A6A6" w:sz="4"/>
+              <w:right w:val="single" w:color="A6A6A6" w:sz="4"/>
+            </w:tcBorders>
+            <w:tcMar>
+              <w:top w:type="dxa" w:w="60"/>
+              <w:left w:type="dxa" w:w="90"/>
+              <w:bottom w:type="dxa" w:w="60"/>
+              <w:right w:type="dxa" w:w="90"/>
+            </w:tcMar>
+          </w:tcPr>
+          <w:p>
+            <w:pPr>
+              <w:spacing w:after="30"/>
+            </w:pPr>
+            <w:r>
+              <w:rPr>
+                <w:sz w:val="18"/>
+                <w:szCs w:val="18"/>
+              </w:rPr>
+              <w:t xml:space="preserve">En verde</w:t>
+            </w:r>
+          </w:p>
+        </w:tc>
+      </w:tr>
+      <w:tr>
+        <w:tc>
+          <w:tcPr>
+            <w:tcW w:type="dxa" w:w="2059"/>
+            <w:tcBorders>
+              <w:top w:val="single" w:color="A6A6A6" w:sz="4"/>
+              <w:left w:val="single" w:color="A6A6A6" w:sz="4"/>
+              <w:bottom w:val="single" w:color="A6A6A6" w:sz="4"/>
+              <w:right w:val="single" w:color="A6A6A6" w:sz="4"/>
+            </w:tcBorders>
+            <w:tcMar>
+              <w:top w:type="dxa" w:w="60"/>
+              <w:left w:type="dxa" w:w="90"/>
+              <w:bottom w:type="dxa" w:w="60"/>
+              <w:right w:type="dxa" w:w="90"/>
+            </w:tcMar>
+          </w:tcPr>
+          <w:p>
+            <w:pPr>
+              <w:spacing w:after="30"/>
+            </w:pPr>
+            <w:r>
+              <w:rPr>
+                <w:sz w:val="18"/>
+                <w:szCs w:val="18"/>
+              </w:rPr>
+              <w:t xml:space="preserve">39042977012</w:t>
+            </w:r>
+          </w:p>
+        </w:tc>
+        <w:tc>
+          <w:tcPr>
+            <w:tcW w:type="dxa" w:w="2620"/>
+            <w:tcBorders>
+              <w:top w:val="single" w:color="A6A6A6" w:sz="4"/>
+              <w:left w:val="single" w:color="A6A6A6" w:sz="4"/>
+              <w:bottom w:val="single" w:color="A6A6A6" w:sz="4"/>
+              <w:right w:val="single" w:color="A6A6A6" w:sz="4"/>
+            </w:tcBorders>
+            <w:tcMar>
+              <w:top w:type="dxa" w:w="60"/>
+              <w:left w:type="dxa" w:w="90"/>
+              <w:bottom w:type="dxa" w:w="60"/>
+              <w:right w:type="dxa" w:w="90"/>
+            </w:tcMar>
+          </w:tcPr>
+          <w:p>
+            <w:pPr>
+              <w:spacing w:after="30"/>
+            </w:pPr>
+            <w:r>
+              <w:rPr>
+                <w:rFonts w:ascii="Consolas" w:cs="Consolas" w:eastAsia="Consolas" w:hAnsi="Consolas"/>
+                <w:sz w:val="18"/>
+                <w:szCs w:val="18"/>
+              </w:rPr>
+              <w:t xml:space="preserve">it-02/bloqueo</w:t>
             </w:r>
           </w:p>
         </w:tc>

</xml_diff>

<commit_message>
docs(informes): defecto de la traza de peticiones detectado al preparar los informes y DIS-40 abierta [AS-03] [DIS-40] [ISO/IEC 27002 8.15] [OWASP ASVS V7.2.1]
Co-Authored-By: Claude Opus 5.5 <noreply@anthropic.com>
</commit_message>
<xml_diff>
--- a/docs/informes/Informe3_Programacion_Segura_AbasteceNi_v1.0.docx
+++ b/docs/informes/Informe3_Programacion_Segura_AbasteceNi_v1.0.docx
@@ -4790,10 +4790,21 @@
           <w:sz w:val="20"/>
           <w:szCs w:val="20"/>
         </w:rPr>
-        <w:t xml:space="preserve">apps/backend/src/aplicacion/transversal/registro-peticiones.interceptor.ts:17</w:t>
-      </w:r>
-      <w:r>
-        <w:t xml:space="preserve">). El filtro de errores registra solo el tipo del error, nunca su mensaje (</w:t>
+        <w:t xml:space="preserve">apps/backend/src/aplicacion/transversal/registro-peticiones.interceptor.ts:19</w:t>
+      </w:r>
+      <w:r>
+        <w:t xml:space="preserve">). El estado se lee al terminar la respuesta: hasta el commit </w:t>
+      </w:r>
+      <w:r>
+        <w:rPr>
+          <w:rFonts w:ascii="Consolas" w:cs="Consolas" w:eastAsia="Consolas" w:hAnsi="Consolas"/>
+          <w:sz w:val="20"/>
+          <w:szCs w:val="20"/>
+        </w:rPr>
+        <w:t xml:space="preserve">2d77994</w:t>
+      </w:r>
+      <w:r>
+        <w:t xml:space="preserve"> constaba el previo al filtro de errores, y una respuesta 410 aparecía como 200 (DIS-40). El filtro de errores registra solo el tipo del error, nunca su mensaje (</w:t>
       </w:r>
       <w:r>
         <w:rPr>
@@ -8512,7 +8523,22 @@
                 <w:sz w:val="18"/>
                 <w:szCs w:val="18"/>
               </w:rPr>
-              <w:t xml:space="preserve">V7.1.1, V7.1.2 (sin credenciales ni datos sensibles en las trazas)</w:t>
+              <w:t xml:space="preserve">V7.1.1, V7.1.2 (sin credenciales ni datos sensibles en las trazas); estado definitivo de cada respuesta en la traza (</w:t>
+            </w:r>
+            <w:r>
+              <w:rPr>
+                <w:rFonts w:ascii="Consolas" w:cs="Consolas" w:eastAsia="Consolas" w:hAnsi="Consolas"/>
+                <w:sz w:val="18"/>
+                <w:szCs w:val="18"/>
+              </w:rPr>
+              <w:t xml:space="preserve">2d77994</w:t>
+            </w:r>
+            <w:r>
+              <w:rPr>
+                <w:sz w:val="18"/>
+                <w:szCs w:val="18"/>
+              </w:rPr>
+              <w:t xml:space="preserve">)</w:t>
             </w:r>
           </w:p>
         </w:tc>
@@ -8541,7 +8567,7 @@
                 <w:sz w:val="18"/>
                 <w:szCs w:val="18"/>
               </w:rPr>
-              <w:t xml:space="preserve">Retención y archivo de la bitácora (SYS-NFN-04)</w:t>
+              <w:t xml:space="preserve">V7.2.1: las peticiones rechazadas por los guards (401, 403, 429) no constan en la traza (DIS-40, abierta); retención y archivo de la bitácora (SYS-NFN-04)</w:t>
             </w:r>
           </w:p>
         </w:tc>
@@ -9478,7 +9504,7 @@
         <w:t xml:space="preserve">docs/evidencia/discrepancias.md</w:t>
       </w:r>
       <w:r>
-        <w:t xml:space="preserve"> (DIS-06, 22, 24, 25, 28, 33, 36, 37 y 38).</w:t>
+        <w:t xml:space="preserve"> (DIS-06, 22, 24, 25, 28, 33, 36, 37, 38 y 40).</w:t>
       </w:r>
     </w:p>
     <w:p>

</xml_diff>